<commit_message>
1.3.5-rasm: uch qatorli (Bazel, Rossiya, O‘zbekiston) variant
Co-Authored-By: Claude Opus 5.5 <noreply@anthropic.com>
Claude-Session: https://claude.ai/code/session_01PxHTC8Q7yHdrpAeUA5KUgM
</commit_message>
<xml_diff>
--- a/paragraflar/rasmlar/1.3.5-rasm.docx
+++ b/paragraflar/rasmlar/1.3.5-rasm.docx
@@ -2,6 +2,20 @@
 <file path=word/document.xml><?xml version="1.0" encoding="utf-8"?>
 <w:document xmlns:wpc="http://schemas.microsoft.com/office/word/2010/wordprocessingCanvas" xmlns:mo="http://schemas.microsoft.com/office/mac/office/2008/main" xmlns:mc="http://schemas.openxmlformats.org/markup-compatibility/2006" xmlns:mv="urn:schemas-microsoft-com:mac:vml" xmlns:o="urn:schemas-microsoft-com:office:office" xmlns:r="http://schemas.openxmlformats.org/officeDocument/2006/relationships" xmlns:m="http://schemas.openxmlformats.org/officeDocument/2006/math" xmlns:v="urn:schemas-microsoft-com:vml" xmlns:wp14="http://schemas.microsoft.com/office/word/2010/wordprocessingDrawing" xmlns:wp="http://schemas.openxmlformats.org/drawingml/2006/wordprocessingDrawing" xmlns:w10="urn:schemas-microsoft-com:office:word" xmlns:w="http://schemas.openxmlformats.org/wordprocessingml/2006/main" xmlns:w14="http://schemas.microsoft.com/office/word/2010/wordml" xmlns:wpg="http://schemas.microsoft.com/office/word/2010/wordprocessingGroup" xmlns:wpi="http://schemas.microsoft.com/office/word/2010/wordprocessingInk" xmlns:wne="http://schemas.microsoft.com/office/word/2006/wordml" xmlns:wps="http://schemas.microsoft.com/office/word/2010/wordprocessingShape" mc:Ignorable="w14 wp14">
   <w:body>
+    <w:p>
+      <w:pPr>
+        <w:spacing w:before="200"/>
+        <w:jc w:val="center"/>
+      </w:pPr>
+      <w:r>
+        <w:rPr>
+          <w:rFonts w:ascii="Times New Roman" w:hAnsi="Times New Roman"/>
+          <w:b/>
+          <w:sz w:val="24"/>
+        </w:rPr>
+        <w:t>a) Bazel qo‘mitasi</w:t>
+      </w:r>
+    </w:p>
     <w:p>
       <w:pPr>
         <w:keepNext/>
@@ -15,13 +29,93 @@
         </w:rPr>
         <w:drawing>
           <wp:inline distT="0" distB="0" distL="0" distR="0">
-            <wp:extent cx="5760000" cy="3240000"/>
+            <wp:extent cx="5760000" cy="1872000"/>
             <wp:effectExtent l="0" t="0" r="0" b="0"/>
-            <wp:docPr id="1001" name="1.3.5-rasm"/>
+            <wp:docPr id="1001" name="1.3.5-rasm-0"/>
             <wp:cNvGraphicFramePr/>
             <a:graphic>
               <a:graphicData uri="http://schemas.openxmlformats.org/drawingml/2006/chart">
                 <c:chart r:id="rId9"/>
+              </a:graphicData>
+            </a:graphic>
+          </wp:inline>
+        </w:drawing>
+      </w:r>
+    </w:p>
+    <w:p>
+      <w:pPr>
+        <w:spacing w:before="200"/>
+        <w:jc w:val="center"/>
+      </w:pPr>
+      <w:r>
+        <w:rPr>
+          <w:rFonts w:ascii="Times New Roman" w:hAnsi="Times New Roman"/>
+          <w:b/>
+          <w:sz w:val="24"/>
+        </w:rPr>
+        <w:t>b) Rossiya</w:t>
+      </w:r>
+    </w:p>
+    <w:p>
+      <w:pPr>
+        <w:keepNext/>
+        <w:spacing w:line="240" w:lineRule="auto" w:before="0" w:after="0"/>
+        <w:ind w:firstLine="0"/>
+        <w:jc w:val="center"/>
+      </w:pPr>
+      <w:r xmlns:a="http://schemas.openxmlformats.org/drawingml/2006/main" xmlns:c="http://schemas.openxmlformats.org/drawingml/2006/chart">
+        <w:rPr>
+          <w:noProof/>
+        </w:rPr>
+        <w:drawing>
+          <wp:inline distT="0" distB="0" distL="0" distR="0">
+            <wp:extent cx="5760000" cy="1872000"/>
+            <wp:effectExtent l="0" t="0" r="0" b="0"/>
+            <wp:docPr id="1002" name="1.3.5-rasm-1"/>
+            <wp:cNvGraphicFramePr/>
+            <a:graphic>
+              <a:graphicData uri="http://schemas.openxmlformats.org/drawingml/2006/chart">
+                <c:chart r:id="rId10"/>
+              </a:graphicData>
+            </a:graphic>
+          </wp:inline>
+        </w:drawing>
+      </w:r>
+    </w:p>
+    <w:p>
+      <w:pPr>
+        <w:spacing w:before="200"/>
+        <w:jc w:val="center"/>
+      </w:pPr>
+      <w:r>
+        <w:rPr>
+          <w:rFonts w:ascii="Times New Roman" w:hAnsi="Times New Roman"/>
+          <w:b/>
+          <w:sz w:val="24"/>
+        </w:rPr>
+        <w:t>c) O‘zbekiston</w:t>
+      </w:r>
+    </w:p>
+    <w:p>
+      <w:pPr>
+        <w:keepNext/>
+        <w:spacing w:line="240" w:lineRule="auto" w:before="0" w:after="0"/>
+        <w:ind w:firstLine="0"/>
+        <w:jc w:val="center"/>
+      </w:pPr>
+      <w:r xmlns:a="http://schemas.openxmlformats.org/drawingml/2006/main" xmlns:c="http://schemas.openxmlformats.org/drawingml/2006/chart">
+        <w:rPr>
+          <w:noProof/>
+        </w:rPr>
+        <w:drawing>
+          <wp:inline distT="0" distB="0" distL="0" distR="0">
+            <wp:extent cx="5760000" cy="1872000"/>
+            <wp:effectExtent l="0" t="0" r="0" b="0"/>
+            <wp:docPr id="1003" name="1.3.5-rasm-2"/>
+            <wp:cNvGraphicFramePr/>
+            <a:graphic>
+              <a:graphicData uri="http://schemas.openxmlformats.org/drawingml/2006/chart">
+                <c:chart r:id="rId11"/>
               </a:graphicData>
             </a:graphic>
           </wp:inline>
@@ -23948,34 +24042,6 @@
             </c:spPr>
           </c:marker>
           <c:dLbls>
-            <c:dLbl>
-              <c:idx val="5"/>
-              <c:delete val="1"/>
-            </c:dLbl>
-            <c:dLbl>
-              <c:idx val="6"/>
-              <c:delete val="1"/>
-            </c:dLbl>
-            <c:dLbl>
-              <c:idx val="7"/>
-              <c:delete val="1"/>
-            </c:dLbl>
-            <c:dLbl>
-              <c:idx val="8"/>
-              <c:delete val="1"/>
-            </c:dLbl>
-            <c:dLbl>
-              <c:idx val="9"/>
-              <c:delete val="1"/>
-            </c:dLbl>
-            <c:dLbl>
-              <c:idx val="10"/>
-              <c:delete val="1"/>
-            </c:dLbl>
-            <c:dLbl>
-              <c:idx val="11"/>
-              <c:delete val="1"/>
-            </c:dLbl>
             <c:spPr>
               <a:noFill/>
               <a:ln>
@@ -23989,7 +24055,7 @@
                 <a:pPr>
                   <a:defRPr sz="1000" b="1">
                     <a:solidFill>
-                      <a:srgbClr val="1F4E79"/>
+                      <a:srgbClr val="2A78D6"/>
                     </a:solidFill>
                     <a:latin typeface="Times New Roman"/>
                     <a:cs typeface="Times New Roman"/>
@@ -24098,12 +24164,187 @@
           </c:yVal>
           <c:smooth val="0"/>
         </c:ser>
+        <c:axId val="333"/>
+        <c:axId val="444"/>
+      </c:scatterChart>
+      <c:valAx>
+        <c:axId val="333"/>
+        <c:scaling>
+          <c:orientation val="minMax"/>
+          <c:max val="2027"/>
+          <c:min val="2014"/>
+        </c:scaling>
+        <c:delete val="0"/>
+        <c:axPos val="b"/>
+        <c:numFmt formatCode="0" sourceLinked="0"/>
+        <c:majorTickMark val="out"/>
+        <c:minorTickMark val="none"/>
+        <c:tickLblPos val="low"/>
+        <c:spPr>
+          <a:ln w="9525">
+            <a:solidFill>
+              <a:srgbClr val="595959"/>
+            </a:solidFill>
+          </a:ln>
+        </c:spPr>
+        <c:txPr>
+          <a:bodyPr/>
+          <a:lstStyle/>
+          <a:p>
+            <a:pPr>
+              <a:defRPr sz="1100" b="0">
+                <a:solidFill>
+                  <a:srgbClr val="000000"/>
+                </a:solidFill>
+                <a:latin typeface="Times New Roman"/>
+                <a:cs typeface="Times New Roman"/>
+              </a:defRPr>
+            </a:pPr>
+            <a:endParaRPr lang="uz-Latn-UZ"/>
+          </a:p>
+        </c:txPr>
+        <c:crossAx val="444"/>
+        <c:crosses val="autoZero"/>
+        <c:crossBetween val="midCat"/>
+        <c:majorUnit val="1"/>
+      </c:valAx>
+      <c:valAx>
+        <c:axId val="444"/>
+        <c:scaling>
+          <c:orientation val="minMax"/>
+          <c:max val="115"/>
+          <c:min val="50"/>
+        </c:scaling>
+        <c:delete val="0"/>
+        <c:axPos val="l"/>
+        <c:majorGridlines>
+          <c:spPr>
+            <a:ln w="6350">
+              <a:solidFill>
+                <a:srgbClr val="D9D9D9"/>
+              </a:solidFill>
+            </a:ln>
+          </c:spPr>
+        </c:majorGridlines>
+        <c:title>
+          <c:tx>
+            <c:rich>
+              <a:bodyPr rot="-5400000" vert="horz"/>
+              <a:lstStyle/>
+              <a:p>
+                <a:pPr>
+                  <a:defRPr sz="1100" b="0">
+                    <a:solidFill>
+                      <a:srgbClr val="000000"/>
+                    </a:solidFill>
+                    <a:latin typeface="Times New Roman"/>
+                    <a:cs typeface="Times New Roman"/>
+                  </a:defRPr>
+                </a:pPr>
+                <a:r>
+                  <a:rPr lang="uz-Latn-UZ" sz="1100" b="0">
+                    <a:solidFill>
+                      <a:srgbClr val="000000"/>
+                    </a:solidFill>
+                    <a:latin typeface="Times New Roman"/>
+                  </a:rPr>
+                  <a:t>%</a:t>
+                </a:r>
+              </a:p>
+            </c:rich>
+          </c:tx>
+          <c:overlay val="0"/>
+        </c:title>
+        <c:numFmt formatCode="General" sourceLinked="0"/>
+        <c:majorTickMark val="out"/>
+        <c:minorTickMark val="none"/>
+        <c:tickLblPos val="low"/>
+        <c:spPr>
+          <a:ln w="9525">
+            <a:solidFill>
+              <a:srgbClr val="595959"/>
+            </a:solidFill>
+          </a:ln>
+        </c:spPr>
+        <c:txPr>
+          <a:bodyPr/>
+          <a:lstStyle/>
+          <a:p>
+            <a:pPr>
+              <a:defRPr sz="1100" b="0">
+                <a:solidFill>
+                  <a:srgbClr val="000000"/>
+                </a:solidFill>
+                <a:latin typeface="Times New Roman"/>
+                <a:cs typeface="Times New Roman"/>
+              </a:defRPr>
+            </a:pPr>
+            <a:endParaRPr lang="uz-Latn-UZ"/>
+          </a:p>
+        </c:txPr>
+        <c:crossAx val="333"/>
+        <c:crosses val="autoZero"/>
+        <c:crossBetween val="midCat"/>
+        <c:majorUnit val="10"/>
+      </c:valAx>
+      <c:spPr>
+        <a:noFill/>
+        <a:ln>
+          <a:noFill/>
+        </a:ln>
+      </c:spPr>
+    </c:plotArea>
+    <c:plotVisOnly val="1"/>
+    <c:dispBlanksAs val="gap"/>
+  </c:chart>
+  <c:spPr>
+    <a:solidFill>
+      <a:srgbClr val="FFFFFF"/>
+    </a:solidFill>
+    <a:ln>
+      <a:noFill/>
+    </a:ln>
+  </c:spPr>
+  <c:txPr>
+    <a:bodyPr/>
+    <a:lstStyle/>
+    <a:p>
+      <a:pPr>
+        <a:defRPr sz="1100" b="0">
+          <a:solidFill>
+            <a:srgbClr val="000000"/>
+          </a:solidFill>
+          <a:latin typeface="Times New Roman"/>
+          <a:cs typeface="Times New Roman"/>
+        </a:defRPr>
+      </a:pPr>
+      <a:endParaRPr lang="uz-Latn-UZ"/>
+    </a:p>
+  </c:txPr>
+  <c:externalData r:id="rId1">
+    <c:autoUpdate val="0"/>
+  </c:externalData>
+</c:chartSpace>
+</file>
+
+<file path=word/charts/chart2.xml><?xml version="1.0" encoding="utf-8"?>
+<c:chartSpace xmlns:c="http://schemas.openxmlformats.org/drawingml/2006/chart" xmlns:a="http://schemas.openxmlformats.org/drawingml/2006/main" xmlns:r="http://schemas.openxmlformats.org/officeDocument/2006/relationships">
+  <c:date1904 val="0"/>
+  <c:lang val="uz-Latn-UZ"/>
+  <c:roundedCorners val="0"/>
+  <c:chart>
+    <c:autoTitleDeleted val="1"/>
+    <c:plotArea>
+      <c:layout/>
+      <c:scatterChart>
+        <c:scatterStyle val="lineMarker"/>
+        <c:varyColors val="0"/>
         <c:ser>
-          <c:idx val="1"/>
-          <c:order val="1"/>
+          <c:idx val="0"/>
+          <c:order val="0"/>
           <c:tx>
             <c:strRef>
-              <c:f>Sheet1!$D$1</c:f>
+              <c:f>Sheet1!$B$1</c:f>
               <c:strCache>
                 <c:ptCount val="1"/>
                 <c:pt idx="0">
@@ -24137,27 +24378,11 @@
               <c:delete val="1"/>
             </c:dLbl>
             <c:dLbl>
-              <c:idx val="5"/>
-              <c:delete val="1"/>
-            </c:dLbl>
-            <c:dLbl>
-              <c:idx val="6"/>
-              <c:delete val="1"/>
-            </c:dLbl>
-            <c:dLbl>
               <c:idx val="7"/>
               <c:delete val="1"/>
             </c:dLbl>
             <c:dLbl>
               <c:idx val="8"/>
-              <c:delete val="1"/>
-            </c:dLbl>
-            <c:dLbl>
-              <c:idx val="10"/>
-              <c:delete val="1"/>
-            </c:dLbl>
-            <c:dLbl>
-              <c:idx val="11"/>
               <c:delete val="1"/>
             </c:dLbl>
             <c:spPr>
@@ -24182,7 +24407,7 @@
                 <a:endParaRPr lang="uz-Latn-UZ"/>
               </a:p>
             </c:txPr>
-            <c:dLblPos val="b"/>
+            <c:dLblPos val="t"/>
             <c:showLegendKey val="0"/>
             <c:showVal val="1"/>
             <c:showCatName val="0"/>
@@ -24192,7 +24417,7 @@
           </c:dLbls>
           <c:xVal>
             <c:numRef>
-              <c:f>Sheet1!$C$2:$C$13</c:f>
+              <c:f>Sheet1!$A$2:$A$13</c:f>
               <c:numCache>
                 <c:formatCode>General</c:formatCode>
                 <c:ptCount val="12"/>
@@ -24237,7 +24462,7 @@
           </c:xVal>
           <c:yVal>
             <c:numRef>
-              <c:f>Sheet1!$D$2:$D$13</c:f>
+              <c:f>Sheet1!$B$2:$B$13</c:f>
               <c:numCache>
                 <c:formatCode>General</c:formatCode>
                 <c:ptCount val="12"/>
@@ -24273,12 +24498,187 @@
           </c:yVal>
           <c:smooth val="0"/>
         </c:ser>
+        <c:axId val="333"/>
+        <c:axId val="444"/>
+      </c:scatterChart>
+      <c:valAx>
+        <c:axId val="333"/>
+        <c:scaling>
+          <c:orientation val="minMax"/>
+          <c:max val="2027"/>
+          <c:min val="2014"/>
+        </c:scaling>
+        <c:delete val="0"/>
+        <c:axPos val="b"/>
+        <c:numFmt formatCode="0" sourceLinked="0"/>
+        <c:majorTickMark val="out"/>
+        <c:minorTickMark val="none"/>
+        <c:tickLblPos val="low"/>
+        <c:spPr>
+          <a:ln w="9525">
+            <a:solidFill>
+              <a:srgbClr val="595959"/>
+            </a:solidFill>
+          </a:ln>
+        </c:spPr>
+        <c:txPr>
+          <a:bodyPr/>
+          <a:lstStyle/>
+          <a:p>
+            <a:pPr>
+              <a:defRPr sz="1100" b="0">
+                <a:solidFill>
+                  <a:srgbClr val="000000"/>
+                </a:solidFill>
+                <a:latin typeface="Times New Roman"/>
+                <a:cs typeface="Times New Roman"/>
+              </a:defRPr>
+            </a:pPr>
+            <a:endParaRPr lang="uz-Latn-UZ"/>
+          </a:p>
+        </c:txPr>
+        <c:crossAx val="444"/>
+        <c:crosses val="autoZero"/>
+        <c:crossBetween val="midCat"/>
+        <c:majorUnit val="1"/>
+      </c:valAx>
+      <c:valAx>
+        <c:axId val="444"/>
+        <c:scaling>
+          <c:orientation val="minMax"/>
+          <c:max val="115"/>
+          <c:min val="50"/>
+        </c:scaling>
+        <c:delete val="0"/>
+        <c:axPos val="l"/>
+        <c:majorGridlines>
+          <c:spPr>
+            <a:ln w="6350">
+              <a:solidFill>
+                <a:srgbClr val="D9D9D9"/>
+              </a:solidFill>
+            </a:ln>
+          </c:spPr>
+        </c:majorGridlines>
+        <c:title>
+          <c:tx>
+            <c:rich>
+              <a:bodyPr rot="-5400000" vert="horz"/>
+              <a:lstStyle/>
+              <a:p>
+                <a:pPr>
+                  <a:defRPr sz="1100" b="0">
+                    <a:solidFill>
+                      <a:srgbClr val="000000"/>
+                    </a:solidFill>
+                    <a:latin typeface="Times New Roman"/>
+                    <a:cs typeface="Times New Roman"/>
+                  </a:defRPr>
+                </a:pPr>
+                <a:r>
+                  <a:rPr lang="uz-Latn-UZ" sz="1100" b="0">
+                    <a:solidFill>
+                      <a:srgbClr val="000000"/>
+                    </a:solidFill>
+                    <a:latin typeface="Times New Roman"/>
+                  </a:rPr>
+                  <a:t>%</a:t>
+                </a:r>
+              </a:p>
+            </c:rich>
+          </c:tx>
+          <c:overlay val="0"/>
+        </c:title>
+        <c:numFmt formatCode="General" sourceLinked="0"/>
+        <c:majorTickMark val="out"/>
+        <c:minorTickMark val="none"/>
+        <c:tickLblPos val="low"/>
+        <c:spPr>
+          <a:ln w="9525">
+            <a:solidFill>
+              <a:srgbClr val="595959"/>
+            </a:solidFill>
+          </a:ln>
+        </c:spPr>
+        <c:txPr>
+          <a:bodyPr/>
+          <a:lstStyle/>
+          <a:p>
+            <a:pPr>
+              <a:defRPr sz="1100" b="0">
+                <a:solidFill>
+                  <a:srgbClr val="000000"/>
+                </a:solidFill>
+                <a:latin typeface="Times New Roman"/>
+                <a:cs typeface="Times New Roman"/>
+              </a:defRPr>
+            </a:pPr>
+            <a:endParaRPr lang="uz-Latn-UZ"/>
+          </a:p>
+        </c:txPr>
+        <c:crossAx val="333"/>
+        <c:crosses val="autoZero"/>
+        <c:crossBetween val="midCat"/>
+        <c:majorUnit val="10"/>
+      </c:valAx>
+      <c:spPr>
+        <a:noFill/>
+        <a:ln>
+          <a:noFill/>
+        </a:ln>
+      </c:spPr>
+    </c:plotArea>
+    <c:plotVisOnly val="1"/>
+    <c:dispBlanksAs val="gap"/>
+  </c:chart>
+  <c:spPr>
+    <a:solidFill>
+      <a:srgbClr val="FFFFFF"/>
+    </a:solidFill>
+    <a:ln>
+      <a:noFill/>
+    </a:ln>
+  </c:spPr>
+  <c:txPr>
+    <a:bodyPr/>
+    <a:lstStyle/>
+    <a:p>
+      <a:pPr>
+        <a:defRPr sz="1100" b="0">
+          <a:solidFill>
+            <a:srgbClr val="000000"/>
+          </a:solidFill>
+          <a:latin typeface="Times New Roman"/>
+          <a:cs typeface="Times New Roman"/>
+        </a:defRPr>
+      </a:pPr>
+      <a:endParaRPr lang="uz-Latn-UZ"/>
+    </a:p>
+  </c:txPr>
+  <c:externalData r:id="rId1">
+    <c:autoUpdate val="0"/>
+  </c:externalData>
+</c:chartSpace>
+</file>
+
+<file path=word/charts/chart3.xml><?xml version="1.0" encoding="utf-8"?>
+<c:chartSpace xmlns:c="http://schemas.openxmlformats.org/drawingml/2006/chart" xmlns:a="http://schemas.openxmlformats.org/drawingml/2006/main" xmlns:r="http://schemas.openxmlformats.org/officeDocument/2006/relationships">
+  <c:date1904 val="0"/>
+  <c:lang val="uz-Latn-UZ"/>
+  <c:roundedCorners val="0"/>
+  <c:chart>
+    <c:autoTitleDeleted val="1"/>
+    <c:plotArea>
+      <c:layout/>
+      <c:scatterChart>
+        <c:scatterStyle val="lineMarker"/>
+        <c:varyColors val="0"/>
         <c:ser>
-          <c:idx val="2"/>
-          <c:order val="2"/>
+          <c:idx val="0"/>
+          <c:order val="0"/>
           <c:tx>
             <c:strRef>
-              <c:f>Sheet1!$F$1</c:f>
+              <c:f>Sheet1!$B$1</c:f>
               <c:strCache>
                 <c:ptCount val="1"/>
                 <c:pt idx="0">
@@ -24311,38 +24711,6 @@
               <c:idx val="0"/>
               <c:delete val="1"/>
             </c:dLbl>
-            <c:dLbl>
-              <c:idx val="4"/>
-              <c:delete val="1"/>
-            </c:dLbl>
-            <c:dLbl>
-              <c:idx val="5"/>
-              <c:delete val="1"/>
-            </c:dLbl>
-            <c:dLbl>
-              <c:idx val="6"/>
-              <c:delete val="1"/>
-            </c:dLbl>
-            <c:dLbl>
-              <c:idx val="7"/>
-              <c:delete val="1"/>
-            </c:dLbl>
-            <c:dLbl>
-              <c:idx val="8"/>
-              <c:delete val="1"/>
-            </c:dLbl>
-            <c:dLbl>
-              <c:idx val="9"/>
-              <c:delete val="1"/>
-            </c:dLbl>
-            <c:dLbl>
-              <c:idx val="10"/>
-              <c:delete val="1"/>
-            </c:dLbl>
-            <c:dLbl>
-              <c:idx val="11"/>
-              <c:delete val="1"/>
-            </c:dLbl>
             <c:spPr>
               <a:noFill/>
               <a:ln>
@@ -24365,7 +24733,7 @@
                 <a:endParaRPr lang="uz-Latn-UZ"/>
               </a:p>
             </c:txPr>
-            <c:dLblPos val="l"/>
+            <c:dLblPos val="t"/>
             <c:showLegendKey val="0"/>
             <c:showVal val="1"/>
             <c:showCatName val="0"/>
@@ -24375,7 +24743,7 @@
           </c:dLbls>
           <c:xVal>
             <c:numRef>
-              <c:f>Sheet1!$E$2:$E$13</c:f>
+              <c:f>Sheet1!$A$2:$A$13</c:f>
               <c:numCache>
                 <c:formatCode>General</c:formatCode>
                 <c:ptCount val="12"/>
@@ -24420,7 +24788,7 @@
           </c:xVal>
           <c:yVal>
             <c:numRef>
-              <c:f>Sheet1!$F$2:$F$13</c:f>
+              <c:f>Sheet1!$B$2:$B$13</c:f>
               <c:numCache>
                 <c:formatCode>General</c:formatCode>
                 <c:ptCount val="12"/>
@@ -24474,35 +24842,6 @@
         </c:scaling>
         <c:delete val="0"/>
         <c:axPos val="b"/>
-        <c:title>
-          <c:tx>
-            <c:rich>
-              <a:bodyPr/>
-              <a:lstStyle/>
-              <a:p>
-                <a:pPr>
-                  <a:defRPr sz="1100" b="0">
-                    <a:solidFill>
-                      <a:srgbClr val="000000"/>
-                    </a:solidFill>
-                    <a:latin typeface="Times New Roman"/>
-                    <a:cs typeface="Times New Roman"/>
-                  </a:defRPr>
-                </a:pPr>
-                <a:r>
-                  <a:rPr lang="uz-Latn-UZ" sz="1100" b="0">
-                    <a:solidFill>
-                      <a:srgbClr val="000000"/>
-                    </a:solidFill>
-                    <a:latin typeface="Times New Roman"/>
-                  </a:rPr>
-                  <a:t>Yillar</a:t>
-                </a:r>
-              </a:p>
-            </c:rich>
-          </c:tx>
-          <c:overlay val="0"/>
-        </c:title>
         <c:numFmt formatCode="0" sourceLinked="0"/>
         <c:majorTickMark val="out"/>
         <c:minorTickMark val="none"/>
@@ -24539,7 +24878,7 @@
         <c:axId val="444"/>
         <c:scaling>
           <c:orientation val="minMax"/>
-          <c:max val="110"/>
+          <c:max val="115"/>
           <c:min val="50"/>
         </c:scaling>
         <c:delete val="0"/>
@@ -24575,7 +24914,7 @@
                     </a:solidFill>
                     <a:latin typeface="Times New Roman"/>
                   </a:rPr>
-                  <a:t>Minimal talab, %</a:t>
+                  <a:t>%</a:t>
                 </a:r>
               </a:p>
             </c:rich>
@@ -24621,26 +24960,6 @@
         </a:ln>
       </c:spPr>
     </c:plotArea>
-    <c:legend>
-      <c:legendPos val="b"/>
-      <c:overlay val="0"/>
-      <c:txPr>
-        <a:bodyPr/>
-        <a:lstStyle/>
-        <a:p>
-          <a:pPr>
-            <a:defRPr sz="1050" b="0">
-              <a:solidFill>
-                <a:srgbClr val="000000"/>
-              </a:solidFill>
-              <a:latin typeface="Times New Roman"/>
-              <a:cs typeface="Times New Roman"/>
-            </a:defRPr>
-          </a:pPr>
-          <a:endParaRPr lang="uz-Latn-UZ"/>
-        </a:p>
-      </c:txPr>
-    </c:legend>
     <c:plotVisOnly val="1"/>
     <c:dispBlanksAs val="gap"/>
   </c:chart>

</xml_diff>